<commit_message>
Withdraw marketing shots of the old adult player.
Playable characters are the eight kids, Haruto by default. Screenshots that show the removed adult student or the old character-select models are no longer used on Facebook cards or Word covers. Current plates live in Marketing/HinhAnh/. Posts without a current shot are text cards labeled CẦN ẢNH MỚI.

Co-authored-by: Quách Thành Long  <stephensouth1307@gmail.com>
</commit_message>
<xml_diff>
--- a/Marketing/KeHoachNam/KeHoach_Nam_2026-2027.docx
+++ b/Marketing/KeHoachNam/KeHoach_Nam_2026-2027.docx
@@ -179,7 +179,7 @@
                     <a:graphicData uri="http://schemas.openxmlformats.org/drawingml/2006/picture">
                       <pic:pic>
                         <pic:nvPicPr>
-                          <pic:cNvPr id="0" name="horizon_day.jpg"/>
+                          <pic:cNvPr id="0" name="pho-ngay.jpg"/>
                           <pic:cNvPicPr/>
                         </pic:nvPicPr>
                         <pic:blipFill>
@@ -1289,7 +1289,7 @@
               <a:graphicData uri="http://schemas.openxmlformats.org/drawingml/2006/picture">
                 <pic:pic>
                   <pic:nvPicPr>
-                    <pic:cNvPr id="0" name="horizon_day.jpg"/>
+                    <pic:cNvPr id="0" name="pho-ngay.jpg"/>
                     <pic:cNvPicPr/>
                   </pic:nvPicPr>
                   <pic:blipFill>
@@ -1327,7 +1327,7 @@
           <w:sz w:val="18"/>
           <w:lang w:val="vi-VN" w:eastAsia="ja-JP"/>
         </w:rPr>
-        <w:t>Phố Hibari-chō ban ngày</w:t>
+        <w:t>Phố Hibari-chō ban ngày, không có nhân vật cận</w:t>
       </w:r>
     </w:p>
     <w:p>
@@ -20324,7 +20324,7 @@
                 <w:sz w:val="18"/>
                 <w:lang w:val="vi-VN" w:eastAsia="ja-JP"/>
               </w:rPr>
-              <w:t>Quyết định dùng horizon_night hay hoãn. Không vẽ bí ngô.</w:t>
+              <w:t>Quyết định dùng Marketing/HinhAnh/BoiCanh/pho-dem.jpg hay hoãn. Không vẽ bí ngô.</w:t>
             </w:r>
           </w:p>
         </w:tc>

</xml_diff>